<commit_message>
docs: update presentation and test reports
</commit_message>
<xml_diff>
--- a/测试分析报告-StructExam.docx
+++ b/测试分析报告-StructExam.docx
@@ -41232,6 +41232,1499 @@
           <w:bCs/>
         </w:rPr>
         <w:t>报告结束</w:t>
+      </w:r>
+    </w:p>
+    <w:p>
+      <w:r>
+        <w:br w:type="page"/>
+      </w:r>
+    </w:p>
+    <w:p>
+      <w:pPr>
+        <w:pStyle w:val="1"/>
+      </w:pPr>
+      <w:r>
+        <w:t>附录：沙箱节点并发端到端补测（2026-06-05）</w:t>
+      </w:r>
+    </w:p>
+    <w:p>
+      <w:r>
+        <w:t>本附录补充 100、200、500、1000 并发任务下的 sandbox-node 端到端判题测试结果。测试口径为：从 Code Service 分布式 load-test 接口批量提交任务开始，到按 taskId 查询到判题结果为止，包含排队、调度、沙箱执行和结果写入。</w:t>
+      </w:r>
+    </w:p>
+    <w:tbl>
+      <w:tblPr>
+        <w:tblStyle w:val="ae"/>
+        <w:tblW w:type="auto" w:w="0"/>
+        <w:jc w:val="center"/>
+        <w:tblLook w:firstColumn="1" w:firstRow="1" w:lastColumn="0" w:lastRow="0" w:noHBand="0" w:noVBand="1" w:val="04A0"/>
+      </w:tblPr>
+      <w:tblGrid>
+        <w:gridCol w:w="903"/>
+        <w:gridCol w:w="903"/>
+        <w:gridCol w:w="903"/>
+        <w:gridCol w:w="903"/>
+        <w:gridCol w:w="903"/>
+        <w:gridCol w:w="903"/>
+        <w:gridCol w:w="903"/>
+        <w:gridCol w:w="903"/>
+        <w:gridCol w:w="903"/>
+        <w:gridCol w:w="903"/>
+      </w:tblGrid>
+      <w:tr>
+        <w:tc>
+          <w:tcPr>
+            <w:tcW w:type="dxa" w:w="792"/>
+            <w:shd w:fill="D9EAF7"/>
+            <w:vAlign w:val="center"/>
+          </w:tcPr>
+          <w:p>
+            <w:pPr>
+              <w:jc w:val="center"/>
+            </w:pPr>
+            <w:r/>
+            <w:r>
+              <w:rPr>
+                <w:rFonts w:ascii="宋体" w:hAnsi="宋体" w:eastAsia="宋体"/>
+                <w:b/>
+                <w:sz w:val="21"/>
+              </w:rPr>
+              <w:t>并发</w:t>
+            </w:r>
+          </w:p>
+        </w:tc>
+        <w:tc>
+          <w:tcPr>
+            <w:tcW w:type="dxa" w:w="792"/>
+            <w:shd w:fill="D9EAF7"/>
+            <w:vAlign w:val="center"/>
+          </w:tcPr>
+          <w:p>
+            <w:pPr>
+              <w:jc w:val="center"/>
+            </w:pPr>
+            <w:r/>
+            <w:r>
+              <w:rPr>
+                <w:rFonts w:ascii="宋体" w:hAnsi="宋体" w:eastAsia="宋体"/>
+                <w:b/>
+                <w:sz w:val="21"/>
+              </w:rPr>
+              <w:t>请求</w:t>
+            </w:r>
+          </w:p>
+        </w:tc>
+        <w:tc>
+          <w:tcPr>
+            <w:tcW w:type="dxa" w:w="792"/>
+            <w:shd w:fill="D9EAF7"/>
+            <w:vAlign w:val="center"/>
+          </w:tcPr>
+          <w:p>
+            <w:pPr>
+              <w:jc w:val="center"/>
+            </w:pPr>
+            <w:r/>
+            <w:r>
+              <w:rPr>
+                <w:rFonts w:ascii="宋体" w:hAnsi="宋体" w:eastAsia="宋体"/>
+                <w:b/>
+                <w:sz w:val="21"/>
+              </w:rPr>
+              <w:t>完成</w:t>
+            </w:r>
+          </w:p>
+        </w:tc>
+        <w:tc>
+          <w:tcPr>
+            <w:tcW w:type="dxa" w:w="1008"/>
+            <w:shd w:fill="D9EAF7"/>
+            <w:vAlign w:val="center"/>
+          </w:tcPr>
+          <w:p>
+            <w:pPr>
+              <w:jc w:val="center"/>
+            </w:pPr>
+            <w:r/>
+            <w:r>
+              <w:rPr>
+                <w:rFonts w:ascii="宋体" w:hAnsi="宋体" w:eastAsia="宋体"/>
+                <w:b/>
+                <w:sz w:val="21"/>
+              </w:rPr>
+              <w:t>成功率</w:t>
+            </w:r>
+          </w:p>
+        </w:tc>
+        <w:tc>
+          <w:tcPr>
+            <w:tcW w:type="dxa" w:w="1080"/>
+            <w:shd w:fill="D9EAF7"/>
+            <w:vAlign w:val="center"/>
+          </w:tcPr>
+          <w:p>
+            <w:pPr>
+              <w:jc w:val="center"/>
+            </w:pPr>
+            <w:r/>
+            <w:r>
+              <w:rPr>
+                <w:rFonts w:ascii="宋体" w:hAnsi="宋体" w:eastAsia="宋体"/>
+                <w:b/>
+                <w:sz w:val="21"/>
+              </w:rPr>
+              <w:t>最小</w:t>
+            </w:r>
+          </w:p>
+        </w:tc>
+        <w:tc>
+          <w:tcPr>
+            <w:tcW w:type="dxa" w:w="1224"/>
+            <w:shd w:fill="D9EAF7"/>
+            <w:vAlign w:val="center"/>
+          </w:tcPr>
+          <w:p>
+            <w:pPr>
+              <w:jc w:val="center"/>
+            </w:pPr>
+            <w:r/>
+            <w:r>
+              <w:rPr>
+                <w:rFonts w:ascii="宋体" w:hAnsi="宋体" w:eastAsia="宋体"/>
+                <w:b/>
+                <w:sz w:val="21"/>
+              </w:rPr>
+              <w:t>最大</w:t>
+            </w:r>
+          </w:p>
+        </w:tc>
+        <w:tc>
+          <w:tcPr>
+            <w:tcW w:type="dxa" w:w="1224"/>
+            <w:shd w:fill="D9EAF7"/>
+            <w:vAlign w:val="center"/>
+          </w:tcPr>
+          <w:p>
+            <w:pPr>
+              <w:jc w:val="center"/>
+            </w:pPr>
+            <w:r/>
+            <w:r>
+              <w:rPr>
+                <w:rFonts w:ascii="宋体" w:hAnsi="宋体" w:eastAsia="宋体"/>
+                <w:b/>
+                <w:sz w:val="21"/>
+              </w:rPr>
+              <w:t>平均</w:t>
+            </w:r>
+          </w:p>
+        </w:tc>
+        <w:tc>
+          <w:tcPr>
+            <w:tcW w:type="dxa" w:w="1080"/>
+            <w:shd w:fill="D9EAF7"/>
+            <w:vAlign w:val="center"/>
+          </w:tcPr>
+          <w:p>
+            <w:pPr>
+              <w:jc w:val="center"/>
+            </w:pPr>
+            <w:r/>
+            <w:r>
+              <w:rPr>
+                <w:rFonts w:ascii="宋体" w:hAnsi="宋体" w:eastAsia="宋体"/>
+                <w:b/>
+                <w:sz w:val="21"/>
+              </w:rPr>
+              <w:t>P95</w:t>
+            </w:r>
+          </w:p>
+        </w:tc>
+        <w:tc>
+          <w:tcPr>
+            <w:tcW w:type="dxa" w:w="1080"/>
+            <w:shd w:fill="D9EAF7"/>
+            <w:vAlign w:val="center"/>
+          </w:tcPr>
+          <w:p>
+            <w:pPr>
+              <w:jc w:val="center"/>
+            </w:pPr>
+            <w:r/>
+            <w:r>
+              <w:rPr>
+                <w:rFonts w:ascii="宋体" w:hAnsi="宋体" w:eastAsia="宋体"/>
+                <w:b/>
+                <w:sz w:val="21"/>
+              </w:rPr>
+              <w:t>P99</w:t>
+            </w:r>
+          </w:p>
+        </w:tc>
+        <w:tc>
+          <w:tcPr>
+            <w:tcW w:type="dxa" w:w="1440"/>
+            <w:shd w:fill="D9EAF7"/>
+            <w:vAlign w:val="center"/>
+          </w:tcPr>
+          <w:p>
+            <w:pPr>
+              <w:jc w:val="center"/>
+            </w:pPr>
+            <w:r/>
+            <w:r>
+              <w:rPr>
+                <w:rFonts w:ascii="宋体" w:hAnsi="宋体" w:eastAsia="宋体"/>
+                <w:b/>
+                <w:sz w:val="21"/>
+              </w:rPr>
+              <w:t>吞吐量</w:t>
+            </w:r>
+          </w:p>
+        </w:tc>
+      </w:tr>
+      <w:tr>
+        <w:tc>
+          <w:tcPr>
+            <w:tcW w:type="dxa" w:w="792"/>
+            <w:vAlign w:val="center"/>
+          </w:tcPr>
+          <w:p>
+            <w:pPr>
+              <w:jc w:val="center"/>
+            </w:pPr>
+            <w:r/>
+            <w:r>
+              <w:rPr>
+                <w:rFonts w:ascii="宋体" w:hAnsi="宋体" w:eastAsia="宋体"/>
+                <w:b w:val="0"/>
+                <w:sz w:val="21"/>
+              </w:rPr>
+              <w:t>100</w:t>
+            </w:r>
+          </w:p>
+        </w:tc>
+        <w:tc>
+          <w:tcPr>
+            <w:tcW w:type="dxa" w:w="792"/>
+            <w:vAlign w:val="center"/>
+          </w:tcPr>
+          <w:p>
+            <w:pPr>
+              <w:jc w:val="center"/>
+            </w:pPr>
+            <w:r/>
+            <w:r>
+              <w:rPr>
+                <w:rFonts w:ascii="宋体" w:hAnsi="宋体" w:eastAsia="宋体"/>
+                <w:b w:val="0"/>
+                <w:sz w:val="21"/>
+              </w:rPr>
+              <w:t>100</w:t>
+            </w:r>
+          </w:p>
+        </w:tc>
+        <w:tc>
+          <w:tcPr>
+            <w:tcW w:type="dxa" w:w="792"/>
+            <w:vAlign w:val="center"/>
+          </w:tcPr>
+          <w:p>
+            <w:pPr>
+              <w:jc w:val="center"/>
+            </w:pPr>
+            <w:r/>
+            <w:r>
+              <w:rPr>
+                <w:rFonts w:ascii="宋体" w:hAnsi="宋体" w:eastAsia="宋体"/>
+                <w:b w:val="0"/>
+                <w:sz w:val="21"/>
+              </w:rPr>
+              <w:t>100</w:t>
+            </w:r>
+          </w:p>
+        </w:tc>
+        <w:tc>
+          <w:tcPr>
+            <w:tcW w:type="dxa" w:w="1008"/>
+            <w:vAlign w:val="center"/>
+          </w:tcPr>
+          <w:p>
+            <w:pPr>
+              <w:jc w:val="center"/>
+            </w:pPr>
+            <w:r/>
+            <w:r>
+              <w:rPr>
+                <w:rFonts w:ascii="宋体" w:hAnsi="宋体" w:eastAsia="宋体"/>
+                <w:b w:val="0"/>
+                <w:sz w:val="21"/>
+              </w:rPr>
+              <w:t>100.0%</w:t>
+            </w:r>
+          </w:p>
+        </w:tc>
+        <w:tc>
+          <w:tcPr>
+            <w:tcW w:type="dxa" w:w="1080"/>
+            <w:vAlign w:val="center"/>
+          </w:tcPr>
+          <w:p>
+            <w:pPr>
+              <w:jc w:val="center"/>
+            </w:pPr>
+            <w:r/>
+            <w:r>
+              <w:rPr>
+                <w:rFonts w:ascii="宋体" w:hAnsi="宋体" w:eastAsia="宋体"/>
+                <w:b w:val="0"/>
+                <w:sz w:val="21"/>
+              </w:rPr>
+              <w:t>3184ms</w:t>
+            </w:r>
+          </w:p>
+        </w:tc>
+        <w:tc>
+          <w:tcPr>
+            <w:tcW w:type="dxa" w:w="1224"/>
+            <w:vAlign w:val="center"/>
+          </w:tcPr>
+          <w:p>
+            <w:pPr>
+              <w:jc w:val="center"/>
+            </w:pPr>
+            <w:r/>
+            <w:r>
+              <w:rPr>
+                <w:rFonts w:ascii="宋体" w:hAnsi="宋体" w:eastAsia="宋体"/>
+                <w:b w:val="0"/>
+                <w:sz w:val="21"/>
+              </w:rPr>
+              <w:t>5418ms</w:t>
+            </w:r>
+          </w:p>
+        </w:tc>
+        <w:tc>
+          <w:tcPr>
+            <w:tcW w:type="dxa" w:w="1224"/>
+            <w:vAlign w:val="center"/>
+          </w:tcPr>
+          <w:p>
+            <w:pPr>
+              <w:jc w:val="center"/>
+            </w:pPr>
+            <w:r/>
+            <w:r>
+              <w:rPr>
+                <w:rFonts w:ascii="宋体" w:hAnsi="宋体" w:eastAsia="宋体"/>
+                <w:b w:val="0"/>
+                <w:sz w:val="21"/>
+              </w:rPr>
+              <w:t>4434ms</w:t>
+            </w:r>
+          </w:p>
+        </w:tc>
+        <w:tc>
+          <w:tcPr>
+            <w:tcW w:type="dxa" w:w="1080"/>
+            <w:vAlign w:val="center"/>
+          </w:tcPr>
+          <w:p>
+            <w:pPr>
+              <w:jc w:val="center"/>
+            </w:pPr>
+            <w:r/>
+            <w:r>
+              <w:rPr>
+                <w:rFonts w:ascii="宋体" w:hAnsi="宋体" w:eastAsia="宋体"/>
+                <w:b w:val="0"/>
+                <w:sz w:val="21"/>
+              </w:rPr>
+              <w:t>5418ms</w:t>
+            </w:r>
+          </w:p>
+        </w:tc>
+        <w:tc>
+          <w:tcPr>
+            <w:tcW w:type="dxa" w:w="1080"/>
+            <w:vAlign w:val="center"/>
+          </w:tcPr>
+          <w:p>
+            <w:pPr>
+              <w:jc w:val="center"/>
+            </w:pPr>
+            <w:r/>
+            <w:r>
+              <w:rPr>
+                <w:rFonts w:ascii="宋体" w:hAnsi="宋体" w:eastAsia="宋体"/>
+                <w:b w:val="0"/>
+                <w:sz w:val="21"/>
+              </w:rPr>
+              <w:t>5418ms</w:t>
+            </w:r>
+          </w:p>
+        </w:tc>
+        <w:tc>
+          <w:tcPr>
+            <w:tcW w:type="dxa" w:w="1440"/>
+            <w:vAlign w:val="center"/>
+          </w:tcPr>
+          <w:p>
+            <w:pPr>
+              <w:jc w:val="center"/>
+            </w:pPr>
+            <w:r/>
+            <w:r>
+              <w:rPr>
+                <w:rFonts w:ascii="宋体" w:hAnsi="宋体" w:eastAsia="宋体"/>
+                <w:b w:val="0"/>
+                <w:sz w:val="21"/>
+              </w:rPr>
+              <w:t>18.5 tasks/s</w:t>
+            </w:r>
+          </w:p>
+        </w:tc>
+      </w:tr>
+      <w:tr>
+        <w:tc>
+          <w:tcPr>
+            <w:tcW w:type="dxa" w:w="792"/>
+            <w:vAlign w:val="center"/>
+          </w:tcPr>
+          <w:p>
+            <w:pPr>
+              <w:jc w:val="center"/>
+            </w:pPr>
+            <w:r/>
+            <w:r>
+              <w:rPr>
+                <w:rFonts w:ascii="宋体" w:hAnsi="宋体" w:eastAsia="宋体"/>
+                <w:b w:val="0"/>
+                <w:sz w:val="21"/>
+              </w:rPr>
+              <w:t>200</w:t>
+            </w:r>
+          </w:p>
+        </w:tc>
+        <w:tc>
+          <w:tcPr>
+            <w:tcW w:type="dxa" w:w="792"/>
+            <w:vAlign w:val="center"/>
+          </w:tcPr>
+          <w:p>
+            <w:pPr>
+              <w:jc w:val="center"/>
+            </w:pPr>
+            <w:r/>
+            <w:r>
+              <w:rPr>
+                <w:rFonts w:ascii="宋体" w:hAnsi="宋体" w:eastAsia="宋体"/>
+                <w:b w:val="0"/>
+                <w:sz w:val="21"/>
+              </w:rPr>
+              <w:t>200</w:t>
+            </w:r>
+          </w:p>
+        </w:tc>
+        <w:tc>
+          <w:tcPr>
+            <w:tcW w:type="dxa" w:w="792"/>
+            <w:vAlign w:val="center"/>
+          </w:tcPr>
+          <w:p>
+            <w:pPr>
+              <w:jc w:val="center"/>
+            </w:pPr>
+            <w:r/>
+            <w:r>
+              <w:rPr>
+                <w:rFonts w:ascii="宋体" w:hAnsi="宋体" w:eastAsia="宋体"/>
+                <w:b w:val="0"/>
+                <w:sz w:val="21"/>
+              </w:rPr>
+              <w:t>200</w:t>
+            </w:r>
+          </w:p>
+        </w:tc>
+        <w:tc>
+          <w:tcPr>
+            <w:tcW w:type="dxa" w:w="1008"/>
+            <w:vAlign w:val="center"/>
+          </w:tcPr>
+          <w:p>
+            <w:pPr>
+              <w:jc w:val="center"/>
+            </w:pPr>
+            <w:r/>
+            <w:r>
+              <w:rPr>
+                <w:rFonts w:ascii="宋体" w:hAnsi="宋体" w:eastAsia="宋体"/>
+                <w:b w:val="0"/>
+                <w:sz w:val="21"/>
+              </w:rPr>
+              <w:t>100.0%</w:t>
+            </w:r>
+          </w:p>
+        </w:tc>
+        <w:tc>
+          <w:tcPr>
+            <w:tcW w:type="dxa" w:w="1080"/>
+            <w:vAlign w:val="center"/>
+          </w:tcPr>
+          <w:p>
+            <w:pPr>
+              <w:jc w:val="center"/>
+            </w:pPr>
+            <w:r/>
+            <w:r>
+              <w:rPr>
+                <w:rFonts w:ascii="宋体" w:hAnsi="宋体" w:eastAsia="宋体"/>
+                <w:b w:val="0"/>
+                <w:sz w:val="21"/>
+              </w:rPr>
+              <w:t>1375ms</w:t>
+            </w:r>
+          </w:p>
+        </w:tc>
+        <w:tc>
+          <w:tcPr>
+            <w:tcW w:type="dxa" w:w="1224"/>
+            <w:vAlign w:val="center"/>
+          </w:tcPr>
+          <w:p>
+            <w:pPr>
+              <w:jc w:val="center"/>
+            </w:pPr>
+            <w:r/>
+            <w:r>
+              <w:rPr>
+                <w:rFonts w:ascii="宋体" w:hAnsi="宋体" w:eastAsia="宋体"/>
+                <w:b w:val="0"/>
+                <w:sz w:val="21"/>
+              </w:rPr>
+              <w:t>3005ms</w:t>
+            </w:r>
+          </w:p>
+        </w:tc>
+        <w:tc>
+          <w:tcPr>
+            <w:tcW w:type="dxa" w:w="1224"/>
+            <w:vAlign w:val="center"/>
+          </w:tcPr>
+          <w:p>
+            <w:pPr>
+              <w:jc w:val="center"/>
+            </w:pPr>
+            <w:r/>
+            <w:r>
+              <w:rPr>
+                <w:rFonts w:ascii="宋体" w:hAnsi="宋体" w:eastAsia="宋体"/>
+                <w:b w:val="0"/>
+                <w:sz w:val="21"/>
+              </w:rPr>
+              <w:t>1882ms</w:t>
+            </w:r>
+          </w:p>
+        </w:tc>
+        <w:tc>
+          <w:tcPr>
+            <w:tcW w:type="dxa" w:w="1080"/>
+            <w:vAlign w:val="center"/>
+          </w:tcPr>
+          <w:p>
+            <w:pPr>
+              <w:jc w:val="center"/>
+            </w:pPr>
+            <w:r/>
+            <w:r>
+              <w:rPr>
+                <w:rFonts w:ascii="宋体" w:hAnsi="宋体" w:eastAsia="宋体"/>
+                <w:b w:val="0"/>
+                <w:sz w:val="21"/>
+              </w:rPr>
+              <w:t>2788ms</w:t>
+            </w:r>
+          </w:p>
+        </w:tc>
+        <w:tc>
+          <w:tcPr>
+            <w:tcW w:type="dxa" w:w="1080"/>
+            <w:vAlign w:val="center"/>
+          </w:tcPr>
+          <w:p>
+            <w:pPr>
+              <w:jc w:val="center"/>
+            </w:pPr>
+            <w:r/>
+            <w:r>
+              <w:rPr>
+                <w:rFonts w:ascii="宋体" w:hAnsi="宋体" w:eastAsia="宋体"/>
+                <w:b w:val="0"/>
+                <w:sz w:val="21"/>
+              </w:rPr>
+              <w:t>3005ms</w:t>
+            </w:r>
+          </w:p>
+        </w:tc>
+        <w:tc>
+          <w:tcPr>
+            <w:tcW w:type="dxa" w:w="1440"/>
+            <w:vAlign w:val="center"/>
+          </w:tcPr>
+          <w:p>
+            <w:pPr>
+              <w:jc w:val="center"/>
+            </w:pPr>
+            <w:r/>
+            <w:r>
+              <w:rPr>
+                <w:rFonts w:ascii="宋体" w:hAnsi="宋体" w:eastAsia="宋体"/>
+                <w:b w:val="0"/>
+                <w:sz w:val="21"/>
+              </w:rPr>
+              <w:t>66.6 tasks/s</w:t>
+            </w:r>
+          </w:p>
+        </w:tc>
+      </w:tr>
+      <w:tr>
+        <w:tc>
+          <w:tcPr>
+            <w:tcW w:type="dxa" w:w="792"/>
+            <w:vAlign w:val="center"/>
+          </w:tcPr>
+          <w:p>
+            <w:pPr>
+              <w:jc w:val="center"/>
+            </w:pPr>
+            <w:r/>
+            <w:r>
+              <w:rPr>
+                <w:rFonts w:ascii="宋体" w:hAnsi="宋体" w:eastAsia="宋体"/>
+                <w:b w:val="0"/>
+                <w:sz w:val="21"/>
+              </w:rPr>
+              <w:t>500</w:t>
+            </w:r>
+          </w:p>
+        </w:tc>
+        <w:tc>
+          <w:tcPr>
+            <w:tcW w:type="dxa" w:w="792"/>
+            <w:vAlign w:val="center"/>
+          </w:tcPr>
+          <w:p>
+            <w:pPr>
+              <w:jc w:val="center"/>
+            </w:pPr>
+            <w:r/>
+            <w:r>
+              <w:rPr>
+                <w:rFonts w:ascii="宋体" w:hAnsi="宋体" w:eastAsia="宋体"/>
+                <w:b w:val="0"/>
+                <w:sz w:val="21"/>
+              </w:rPr>
+              <w:t>500</w:t>
+            </w:r>
+          </w:p>
+        </w:tc>
+        <w:tc>
+          <w:tcPr>
+            <w:tcW w:type="dxa" w:w="792"/>
+            <w:vAlign w:val="center"/>
+          </w:tcPr>
+          <w:p>
+            <w:pPr>
+              <w:jc w:val="center"/>
+            </w:pPr>
+            <w:r/>
+            <w:r>
+              <w:rPr>
+                <w:rFonts w:ascii="宋体" w:hAnsi="宋体" w:eastAsia="宋体"/>
+                <w:b w:val="0"/>
+                <w:sz w:val="21"/>
+              </w:rPr>
+              <w:t>500</w:t>
+            </w:r>
+          </w:p>
+        </w:tc>
+        <w:tc>
+          <w:tcPr>
+            <w:tcW w:type="dxa" w:w="1008"/>
+            <w:vAlign w:val="center"/>
+          </w:tcPr>
+          <w:p>
+            <w:pPr>
+              <w:jc w:val="center"/>
+            </w:pPr>
+            <w:r/>
+            <w:r>
+              <w:rPr>
+                <w:rFonts w:ascii="宋体" w:hAnsi="宋体" w:eastAsia="宋体"/>
+                <w:b w:val="0"/>
+                <w:sz w:val="21"/>
+              </w:rPr>
+              <w:t>100.0%</w:t>
+            </w:r>
+          </w:p>
+        </w:tc>
+        <w:tc>
+          <w:tcPr>
+            <w:tcW w:type="dxa" w:w="1080"/>
+            <w:vAlign w:val="center"/>
+          </w:tcPr>
+          <w:p>
+            <w:pPr>
+              <w:jc w:val="center"/>
+            </w:pPr>
+            <w:r/>
+            <w:r>
+              <w:rPr>
+                <w:rFonts w:ascii="宋体" w:hAnsi="宋体" w:eastAsia="宋体"/>
+                <w:b w:val="0"/>
+                <w:sz w:val="21"/>
+              </w:rPr>
+              <w:t>2062ms</w:t>
+            </w:r>
+          </w:p>
+        </w:tc>
+        <w:tc>
+          <w:tcPr>
+            <w:tcW w:type="dxa" w:w="1224"/>
+            <w:vAlign w:val="center"/>
+          </w:tcPr>
+          <w:p>
+            <w:pPr>
+              <w:jc w:val="center"/>
+            </w:pPr>
+            <w:r/>
+            <w:r>
+              <w:rPr>
+                <w:rFonts w:ascii="宋体" w:hAnsi="宋体" w:eastAsia="宋体"/>
+                <w:b w:val="0"/>
+                <w:sz w:val="21"/>
+              </w:rPr>
+              <w:t>7025ms</w:t>
+            </w:r>
+          </w:p>
+        </w:tc>
+        <w:tc>
+          <w:tcPr>
+            <w:tcW w:type="dxa" w:w="1224"/>
+            <w:vAlign w:val="center"/>
+          </w:tcPr>
+          <w:p>
+            <w:pPr>
+              <w:jc w:val="center"/>
+            </w:pPr>
+            <w:r/>
+            <w:r>
+              <w:rPr>
+                <w:rFonts w:ascii="宋体" w:hAnsi="宋体" w:eastAsia="宋体"/>
+                <w:b w:val="0"/>
+                <w:sz w:val="21"/>
+              </w:rPr>
+              <w:t>4028ms</w:t>
+            </w:r>
+          </w:p>
+        </w:tc>
+        <w:tc>
+          <w:tcPr>
+            <w:tcW w:type="dxa" w:w="1080"/>
+            <w:vAlign w:val="center"/>
+          </w:tcPr>
+          <w:p>
+            <w:pPr>
+              <w:jc w:val="center"/>
+            </w:pPr>
+            <w:r/>
+            <w:r>
+              <w:rPr>
+                <w:rFonts w:ascii="宋体" w:hAnsi="宋体" w:eastAsia="宋体"/>
+                <w:b w:val="0"/>
+                <w:sz w:val="21"/>
+              </w:rPr>
+              <w:t>6811ms</w:t>
+            </w:r>
+          </w:p>
+        </w:tc>
+        <w:tc>
+          <w:tcPr>
+            <w:tcW w:type="dxa" w:w="1080"/>
+            <w:vAlign w:val="center"/>
+          </w:tcPr>
+          <w:p>
+            <w:pPr>
+              <w:jc w:val="center"/>
+            </w:pPr>
+            <w:r/>
+            <w:r>
+              <w:rPr>
+                <w:rFonts w:ascii="宋体" w:hAnsi="宋体" w:eastAsia="宋体"/>
+                <w:b w:val="0"/>
+                <w:sz w:val="21"/>
+              </w:rPr>
+              <w:t>7025ms</w:t>
+            </w:r>
+          </w:p>
+        </w:tc>
+        <w:tc>
+          <w:tcPr>
+            <w:tcW w:type="dxa" w:w="1440"/>
+            <w:vAlign w:val="center"/>
+          </w:tcPr>
+          <w:p>
+            <w:pPr>
+              <w:jc w:val="center"/>
+            </w:pPr>
+            <w:r/>
+            <w:r>
+              <w:rPr>
+                <w:rFonts w:ascii="宋体" w:hAnsi="宋体" w:eastAsia="宋体"/>
+                <w:b w:val="0"/>
+                <w:sz w:val="21"/>
+              </w:rPr>
+              <w:t>71.2 tasks/s</w:t>
+            </w:r>
+          </w:p>
+        </w:tc>
+      </w:tr>
+      <w:tr>
+        <w:tc>
+          <w:tcPr>
+            <w:tcW w:type="dxa" w:w="792"/>
+            <w:vAlign w:val="center"/>
+          </w:tcPr>
+          <w:p>
+            <w:pPr>
+              <w:jc w:val="center"/>
+            </w:pPr>
+            <w:r/>
+            <w:r>
+              <w:rPr>
+                <w:rFonts w:ascii="宋体" w:hAnsi="宋体" w:eastAsia="宋体"/>
+                <w:b w:val="0"/>
+                <w:sz w:val="21"/>
+              </w:rPr>
+              <w:t>1000</w:t>
+            </w:r>
+          </w:p>
+        </w:tc>
+        <w:tc>
+          <w:tcPr>
+            <w:tcW w:type="dxa" w:w="792"/>
+            <w:vAlign w:val="center"/>
+          </w:tcPr>
+          <w:p>
+            <w:pPr>
+              <w:jc w:val="center"/>
+            </w:pPr>
+            <w:r/>
+            <w:r>
+              <w:rPr>
+                <w:rFonts w:ascii="宋体" w:hAnsi="宋体" w:eastAsia="宋体"/>
+                <w:b w:val="0"/>
+                <w:sz w:val="21"/>
+              </w:rPr>
+              <w:t>1000</w:t>
+            </w:r>
+          </w:p>
+        </w:tc>
+        <w:tc>
+          <w:tcPr>
+            <w:tcW w:type="dxa" w:w="792"/>
+            <w:vAlign w:val="center"/>
+          </w:tcPr>
+          <w:p>
+            <w:pPr>
+              <w:jc w:val="center"/>
+            </w:pPr>
+            <w:r/>
+            <w:r>
+              <w:rPr>
+                <w:rFonts w:ascii="宋体" w:hAnsi="宋体" w:eastAsia="宋体"/>
+                <w:b w:val="0"/>
+                <w:sz w:val="21"/>
+              </w:rPr>
+              <w:t>1000</w:t>
+            </w:r>
+          </w:p>
+        </w:tc>
+        <w:tc>
+          <w:tcPr>
+            <w:tcW w:type="dxa" w:w="1008"/>
+            <w:vAlign w:val="center"/>
+          </w:tcPr>
+          <w:p>
+            <w:pPr>
+              <w:jc w:val="center"/>
+            </w:pPr>
+            <w:r/>
+            <w:r>
+              <w:rPr>
+                <w:rFonts w:ascii="宋体" w:hAnsi="宋体" w:eastAsia="宋体"/>
+                <w:b w:val="0"/>
+                <w:sz w:val="21"/>
+              </w:rPr>
+              <w:t>100.0%</w:t>
+            </w:r>
+          </w:p>
+        </w:tc>
+        <w:tc>
+          <w:tcPr>
+            <w:tcW w:type="dxa" w:w="1080"/>
+            <w:vAlign w:val="center"/>
+          </w:tcPr>
+          <w:p>
+            <w:pPr>
+              <w:jc w:val="center"/>
+            </w:pPr>
+            <w:r/>
+            <w:r>
+              <w:rPr>
+                <w:rFonts w:ascii="宋体" w:hAnsi="宋体" w:eastAsia="宋体"/>
+                <w:b w:val="0"/>
+                <w:sz w:val="21"/>
+              </w:rPr>
+              <w:t>3702ms</w:t>
+            </w:r>
+          </w:p>
+        </w:tc>
+        <w:tc>
+          <w:tcPr>
+            <w:tcW w:type="dxa" w:w="1224"/>
+            <w:vAlign w:val="center"/>
+          </w:tcPr>
+          <w:p>
+            <w:pPr>
+              <w:jc w:val="center"/>
+            </w:pPr>
+            <w:r/>
+            <w:r>
+              <w:rPr>
+                <w:rFonts w:ascii="宋体" w:hAnsi="宋体" w:eastAsia="宋体"/>
+                <w:b w:val="0"/>
+                <w:sz w:val="21"/>
+              </w:rPr>
+              <w:t>13836ms</w:t>
+            </w:r>
+          </w:p>
+        </w:tc>
+        <w:tc>
+          <w:tcPr>
+            <w:tcW w:type="dxa" w:w="1224"/>
+            <w:vAlign w:val="center"/>
+          </w:tcPr>
+          <w:p>
+            <w:pPr>
+              <w:jc w:val="center"/>
+            </w:pPr>
+            <w:r/>
+            <w:r>
+              <w:rPr>
+                <w:rFonts w:ascii="宋体" w:hAnsi="宋体" w:eastAsia="宋体"/>
+                <w:b w:val="0"/>
+                <w:sz w:val="21"/>
+              </w:rPr>
+              <w:t>7589ms</w:t>
+            </w:r>
+          </w:p>
+        </w:tc>
+        <w:tc>
+          <w:tcPr>
+            <w:tcW w:type="dxa" w:w="1080"/>
+            <w:vAlign w:val="center"/>
+          </w:tcPr>
+          <w:p>
+            <w:pPr>
+              <w:jc w:val="center"/>
+            </w:pPr>
+            <w:r/>
+            <w:r>
+              <w:rPr>
+                <w:rFonts w:ascii="宋体" w:hAnsi="宋体" w:eastAsia="宋体"/>
+                <w:b w:val="0"/>
+                <w:sz w:val="21"/>
+              </w:rPr>
+              <w:t>13184ms</w:t>
+            </w:r>
+          </w:p>
+        </w:tc>
+        <w:tc>
+          <w:tcPr>
+            <w:tcW w:type="dxa" w:w="1080"/>
+            <w:vAlign w:val="center"/>
+          </w:tcPr>
+          <w:p>
+            <w:pPr>
+              <w:jc w:val="center"/>
+            </w:pPr>
+            <w:r/>
+            <w:r>
+              <w:rPr>
+                <w:rFonts w:ascii="宋体" w:hAnsi="宋体" w:eastAsia="宋体"/>
+                <w:b w:val="0"/>
+                <w:sz w:val="21"/>
+              </w:rPr>
+              <w:t>13626ms</w:t>
+            </w:r>
+          </w:p>
+        </w:tc>
+        <w:tc>
+          <w:tcPr>
+            <w:tcW w:type="dxa" w:w="1440"/>
+            <w:vAlign w:val="center"/>
+          </w:tcPr>
+          <w:p>
+            <w:pPr>
+              <w:jc w:val="center"/>
+            </w:pPr>
+            <w:r/>
+            <w:r>
+              <w:rPr>
+                <w:rFonts w:ascii="宋体" w:hAnsi="宋体" w:eastAsia="宋体"/>
+                <w:b w:val="0"/>
+                <w:sz w:val="21"/>
+              </w:rPr>
+              <w:t>72.3 tasks/s</w:t>
+            </w:r>
+          </w:p>
+        </w:tc>
+      </w:tr>
+    </w:tbl>
+    <w:p/>
+    <w:tbl>
+      <w:tblPr>
+        <w:tblStyle w:val="ae"/>
+        <w:tblW w:type="auto" w:w="0"/>
+        <w:jc w:val="center"/>
+        <w:tblLook w:firstColumn="1" w:firstRow="1" w:lastColumn="0" w:lastRow="0" w:noHBand="0" w:noVBand="1" w:val="04A0"/>
+      </w:tblPr>
+      <w:tblGrid>
+        <w:gridCol w:w="2256"/>
+        <w:gridCol w:w="2256"/>
+        <w:gridCol w:w="2256"/>
+        <w:gridCol w:w="2256"/>
+      </w:tblGrid>
+      <w:tr>
+        <w:tc>
+          <w:tcPr>
+            <w:tcW w:type="dxa" w:w="1152"/>
+            <w:shd w:fill="D9EAF7"/>
+            <w:vAlign w:val="center"/>
+          </w:tcPr>
+          <w:p>
+            <w:pPr>
+              <w:jc w:val="center"/>
+            </w:pPr>
+            <w:r/>
+            <w:r>
+              <w:rPr>
+                <w:rFonts w:ascii="宋体" w:hAnsi="宋体" w:eastAsia="宋体"/>
+                <w:b/>
+                <w:sz w:val="21"/>
+              </w:rPr>
+              <w:t>并发</w:t>
+            </w:r>
+          </w:p>
+        </w:tc>
+        <w:tc>
+          <w:tcPr>
+            <w:tcW w:type="dxa" w:w="2880"/>
+            <w:shd w:fill="D9EAF7"/>
+            <w:vAlign w:val="center"/>
+          </w:tcPr>
+          <w:p>
+            <w:pPr>
+              <w:jc w:val="center"/>
+            </w:pPr>
+            <w:r/>
+            <w:r>
+              <w:rPr>
+                <w:rFonts w:ascii="宋体" w:hAnsi="宋体" w:eastAsia="宋体"/>
+                <w:b/>
+                <w:sz w:val="21"/>
+              </w:rPr>
+              <w:t>节点分配结果</w:t>
+            </w:r>
+          </w:p>
+        </w:tc>
+        <w:tc>
+          <w:tcPr>
+            <w:tcW w:type="dxa" w:w="1584"/>
+            <w:shd w:fill="D9EAF7"/>
+            <w:vAlign w:val="center"/>
+          </w:tcPr>
+          <w:p>
+            <w:pPr>
+              <w:jc w:val="center"/>
+            </w:pPr>
+            <w:r/>
+            <w:r>
+              <w:rPr>
+                <w:rFonts w:ascii="宋体" w:hAnsi="宋体" w:eastAsia="宋体"/>
+                <w:b/>
+                <w:sz w:val="21"/>
+              </w:rPr>
+              <w:t>最大最小差</w:t>
+            </w:r>
+          </w:p>
+        </w:tc>
+        <w:tc>
+          <w:tcPr>
+            <w:tcW w:type="dxa" w:w="4320"/>
+            <w:shd w:fill="D9EAF7"/>
+            <w:vAlign w:val="center"/>
+          </w:tcPr>
+          <w:p>
+            <w:pPr>
+              <w:jc w:val="center"/>
+            </w:pPr>
+            <w:r/>
+            <w:r>
+              <w:rPr>
+                <w:rFonts w:ascii="宋体" w:hAnsi="宋体" w:eastAsia="宋体"/>
+                <w:b/>
+                <w:sz w:val="21"/>
+              </w:rPr>
+              <w:t>结论</w:t>
+            </w:r>
+          </w:p>
+        </w:tc>
+      </w:tr>
+      <w:tr>
+        <w:tc>
+          <w:tcPr>
+            <w:tcW w:type="dxa" w:w="1152"/>
+            <w:vAlign w:val="center"/>
+          </w:tcPr>
+          <w:p>
+            <w:pPr>
+              <w:jc w:val="center"/>
+            </w:pPr>
+            <w:r/>
+            <w:r>
+              <w:rPr>
+                <w:rFonts w:ascii="宋体" w:hAnsi="宋体" w:eastAsia="宋体"/>
+                <w:b w:val="0"/>
+                <w:sz w:val="21"/>
+              </w:rPr>
+              <w:t>100</w:t>
+            </w:r>
+          </w:p>
+        </w:tc>
+        <w:tc>
+          <w:tcPr>
+            <w:tcW w:type="dxa" w:w="2880"/>
+            <w:vAlign w:val="center"/>
+          </w:tcPr>
+          <w:p>
+            <w:pPr>
+              <w:jc w:val="center"/>
+            </w:pPr>
+            <w:r/>
+            <w:r>
+              <w:rPr>
+                <w:rFonts w:ascii="宋体" w:hAnsi="宋体" w:eastAsia="宋体"/>
+                <w:b w:val="0"/>
+                <w:sz w:val="21"/>
+              </w:rPr>
+              <w:t>35 / 31 / 34</w:t>
+            </w:r>
+          </w:p>
+        </w:tc>
+        <w:tc>
+          <w:tcPr>
+            <w:tcW w:type="dxa" w:w="1584"/>
+            <w:vAlign w:val="center"/>
+          </w:tcPr>
+          <w:p>
+            <w:pPr>
+              <w:jc w:val="center"/>
+            </w:pPr>
+            <w:r/>
+            <w:r>
+              <w:rPr>
+                <w:rFonts w:ascii="宋体" w:hAnsi="宋体" w:eastAsia="宋体"/>
+                <w:b w:val="0"/>
+                <w:sz w:val="21"/>
+              </w:rPr>
+              <w:t>4</w:t>
+            </w:r>
+          </w:p>
+        </w:tc>
+        <w:tc>
+          <w:tcPr>
+            <w:tcW w:type="dxa" w:w="4320"/>
+            <w:vAlign w:val="center"/>
+          </w:tcPr>
+          <w:p>
+            <w:pPr>
+              <w:jc w:val="center"/>
+            </w:pPr>
+            <w:r/>
+            <w:r>
+              <w:rPr>
+                <w:rFonts w:ascii="宋体" w:hAnsi="宋体" w:eastAsia="宋体"/>
+                <w:b w:val="0"/>
+                <w:sz w:val="21"/>
+              </w:rPr>
+              <w:t>任务分配基本均匀</w:t>
+            </w:r>
+          </w:p>
+        </w:tc>
+      </w:tr>
+      <w:tr>
+        <w:tc>
+          <w:tcPr>
+            <w:tcW w:type="dxa" w:w="1152"/>
+            <w:vAlign w:val="center"/>
+          </w:tcPr>
+          <w:p>
+            <w:pPr>
+              <w:jc w:val="center"/>
+            </w:pPr>
+            <w:r/>
+            <w:r>
+              <w:rPr>
+                <w:rFonts w:ascii="宋体" w:hAnsi="宋体" w:eastAsia="宋体"/>
+                <w:b w:val="0"/>
+                <w:sz w:val="21"/>
+              </w:rPr>
+              <w:t>200</w:t>
+            </w:r>
+          </w:p>
+        </w:tc>
+        <w:tc>
+          <w:tcPr>
+            <w:tcW w:type="dxa" w:w="2880"/>
+            <w:vAlign w:val="center"/>
+          </w:tcPr>
+          <w:p>
+            <w:pPr>
+              <w:jc w:val="center"/>
+            </w:pPr>
+            <w:r/>
+            <w:r>
+              <w:rPr>
+                <w:rFonts w:ascii="宋体" w:hAnsi="宋体" w:eastAsia="宋体"/>
+                <w:b w:val="0"/>
+                <w:sz w:val="21"/>
+              </w:rPr>
+              <w:t>68 / 67 / 65</w:t>
+            </w:r>
+          </w:p>
+        </w:tc>
+        <w:tc>
+          <w:tcPr>
+            <w:tcW w:type="dxa" w:w="1584"/>
+            <w:vAlign w:val="center"/>
+          </w:tcPr>
+          <w:p>
+            <w:pPr>
+              <w:jc w:val="center"/>
+            </w:pPr>
+            <w:r/>
+            <w:r>
+              <w:rPr>
+                <w:rFonts w:ascii="宋体" w:hAnsi="宋体" w:eastAsia="宋体"/>
+                <w:b w:val="0"/>
+                <w:sz w:val="21"/>
+              </w:rPr>
+              <w:t>3</w:t>
+            </w:r>
+          </w:p>
+        </w:tc>
+        <w:tc>
+          <w:tcPr>
+            <w:tcW w:type="dxa" w:w="4320"/>
+            <w:vAlign w:val="center"/>
+          </w:tcPr>
+          <w:p>
+            <w:pPr>
+              <w:jc w:val="center"/>
+            </w:pPr>
+            <w:r/>
+            <w:r>
+              <w:rPr>
+                <w:rFonts w:ascii="宋体" w:hAnsi="宋体" w:eastAsia="宋体"/>
+                <w:b w:val="0"/>
+                <w:sz w:val="21"/>
+              </w:rPr>
+              <w:t>任务分配基本均匀</w:t>
+            </w:r>
+          </w:p>
+        </w:tc>
+      </w:tr>
+      <w:tr>
+        <w:tc>
+          <w:tcPr>
+            <w:tcW w:type="dxa" w:w="1152"/>
+            <w:vAlign w:val="center"/>
+          </w:tcPr>
+          <w:p>
+            <w:pPr>
+              <w:jc w:val="center"/>
+            </w:pPr>
+            <w:r/>
+            <w:r>
+              <w:rPr>
+                <w:rFonts w:ascii="宋体" w:hAnsi="宋体" w:eastAsia="宋体"/>
+                <w:b w:val="0"/>
+                <w:sz w:val="21"/>
+              </w:rPr>
+              <w:t>500</w:t>
+            </w:r>
+          </w:p>
+        </w:tc>
+        <w:tc>
+          <w:tcPr>
+            <w:tcW w:type="dxa" w:w="2880"/>
+            <w:vAlign w:val="center"/>
+          </w:tcPr>
+          <w:p>
+            <w:pPr>
+              <w:jc w:val="center"/>
+            </w:pPr>
+            <w:r/>
+            <w:r>
+              <w:rPr>
+                <w:rFonts w:ascii="宋体" w:hAnsi="宋体" w:eastAsia="宋体"/>
+                <w:b w:val="0"/>
+                <w:sz w:val="21"/>
+              </w:rPr>
+              <w:t>168 / 166 / 166</w:t>
+            </w:r>
+          </w:p>
+        </w:tc>
+        <w:tc>
+          <w:tcPr>
+            <w:tcW w:type="dxa" w:w="1584"/>
+            <w:vAlign w:val="center"/>
+          </w:tcPr>
+          <w:p>
+            <w:pPr>
+              <w:jc w:val="center"/>
+            </w:pPr>
+            <w:r/>
+            <w:r>
+              <w:rPr>
+                <w:rFonts w:ascii="宋体" w:hAnsi="宋体" w:eastAsia="宋体"/>
+                <w:b w:val="0"/>
+                <w:sz w:val="21"/>
+              </w:rPr>
+              <w:t>2</w:t>
+            </w:r>
+          </w:p>
+        </w:tc>
+        <w:tc>
+          <w:tcPr>
+            <w:tcW w:type="dxa" w:w="4320"/>
+            <w:vAlign w:val="center"/>
+          </w:tcPr>
+          <w:p>
+            <w:pPr>
+              <w:jc w:val="center"/>
+            </w:pPr>
+            <w:r/>
+            <w:r>
+              <w:rPr>
+                <w:rFonts w:ascii="宋体" w:hAnsi="宋体" w:eastAsia="宋体"/>
+                <w:b w:val="0"/>
+                <w:sz w:val="21"/>
+              </w:rPr>
+              <w:t>任务分配非常均匀</w:t>
+            </w:r>
+          </w:p>
+        </w:tc>
+      </w:tr>
+      <w:tr>
+        <w:tc>
+          <w:tcPr>
+            <w:tcW w:type="dxa" w:w="1152"/>
+            <w:vAlign w:val="center"/>
+          </w:tcPr>
+          <w:p>
+            <w:pPr>
+              <w:jc w:val="center"/>
+            </w:pPr>
+            <w:r/>
+            <w:r>
+              <w:rPr>
+                <w:rFonts w:ascii="宋体" w:hAnsi="宋体" w:eastAsia="宋体"/>
+                <w:b w:val="0"/>
+                <w:sz w:val="21"/>
+              </w:rPr>
+              <w:t>1000</w:t>
+            </w:r>
+          </w:p>
+        </w:tc>
+        <w:tc>
+          <w:tcPr>
+            <w:tcW w:type="dxa" w:w="2880"/>
+            <w:vAlign w:val="center"/>
+          </w:tcPr>
+          <w:p>
+            <w:pPr>
+              <w:jc w:val="center"/>
+            </w:pPr>
+            <w:r/>
+            <w:r>
+              <w:rPr>
+                <w:rFonts w:ascii="宋体" w:hAnsi="宋体" w:eastAsia="宋体"/>
+                <w:b w:val="0"/>
+                <w:sz w:val="21"/>
+              </w:rPr>
+              <w:t>334 / 333 / 333</w:t>
+            </w:r>
+          </w:p>
+        </w:tc>
+        <w:tc>
+          <w:tcPr>
+            <w:tcW w:type="dxa" w:w="1584"/>
+            <w:vAlign w:val="center"/>
+          </w:tcPr>
+          <w:p>
+            <w:pPr>
+              <w:jc w:val="center"/>
+            </w:pPr>
+            <w:r/>
+            <w:r>
+              <w:rPr>
+                <w:rFonts w:ascii="宋体" w:hAnsi="宋体" w:eastAsia="宋体"/>
+                <w:b w:val="0"/>
+                <w:sz w:val="21"/>
+              </w:rPr>
+              <w:t>1</w:t>
+            </w:r>
+          </w:p>
+        </w:tc>
+        <w:tc>
+          <w:tcPr>
+            <w:tcW w:type="dxa" w:w="4320"/>
+            <w:vAlign w:val="center"/>
+          </w:tcPr>
+          <w:p>
+            <w:pPr>
+              <w:jc w:val="center"/>
+            </w:pPr>
+            <w:r/>
+            <w:r>
+              <w:rPr>
+                <w:rFonts w:ascii="宋体" w:hAnsi="宋体" w:eastAsia="宋体"/>
+                <w:b w:val="0"/>
+                <w:sz w:val="21"/>
+              </w:rPr>
+              <w:t>任务分配非常均匀</w:t>
+            </w:r>
+          </w:p>
+        </w:tc>
+      </w:tr>
+    </w:tbl>
+    <w:p/>
+    <w:p>
+      <w:r>
+        <w:t>结论：1800 个补测任务全部完成，错误率 0%，pending=0；1000 并发下 P99=13.626s，低于 15 秒级判题返回目标；三节点分配 334/333/333，证明分布式调度和负载均衡链路真实生效。</w:t>
       </w:r>
     </w:p>
     <w:sectPr>

</xml_diff>